<commit_message>
feat: refine UI CV
</commit_message>
<xml_diff>
--- a/docs/mo-ta-api/mo-ta-api-extension-backend-vcs-portal-refined-summary.docx
+++ b/docs/mo-ta-api/mo-ta-api-extension-backend-vcs-portal-refined-summary.docx
@@ -1,5 +1,5 @@
 
-<file path=word\document.xml><?xml version="1.0" encoding="utf-8"?>
+<file path=word/document.xml><?xml version="1.0" encoding="utf-8"?>
 <w:document xmlns:w="http://schemas.openxmlformats.org/wordprocessingml/2006/main" xmlns:r="http://schemas.openxmlformats.org/officeDocument/2006/relationships">
   <w:body>
     <w:p>
@@ -32851,6 +32851,951 @@
         </w:tc>
       </w:tr>
     </w:tbl>
+    <w:p>
+      <w:pPr>
+        <w:pStyle w:val="Heading1"/>
+      </w:pPr>
+      <w:r>
+        <w:t>Phụ lục: Mã lỗi và message lỗi theo API</w:t>
+      </w:r>
+    </w:p>
+    <w:p>
+      <w:r>
+        <w:t>Cập nhật: 2026-07-16. Nguồn rà soát: ApiExceptionFilter, controller, DTO và service trong apps/backend/src.</w:t>
+      </w:r>
+    </w:p>
+    <w:p>
+      <w:r>
+        <w:t>Cách đọc: các lỗi chung áp dụng cho mọi API có cùng điều kiện. Các API protected ngoài auth/login và auth/refresh đều có thể trả UNAUTHORIZED/FORBIDDEN. Các lỗi BadRequestException không có code explicit được ApiExceptionFilter public thành VALIDATION_ERROR với message chung.</w:t>
+      </w:r>
+    </w:p>
+    <w:p>
+      <w:pPr>
+        <w:pStyle w:val="Heading2"/>
+      </w:pPr>
+      <w:r>
+        <w:t>Lỗi chung của hệ thống</w:t>
+      </w:r>
+    </w:p>
+    <w:p>
+      <w:r>
+        <w:t>VALIDATION_ERROR | 400 | Request payload is invalid. | DTO/class-validator lỗi, query/path/body sai format, hoặc BadRequestException không có code explicit. details có thể chứa lỗi validate.</w:t>
+      </w:r>
+    </w:p>
+    <w:p>
+      <w:r>
+        <w:t>UNAUTHORIZED | 401 | Authentication is required. | Thiếu/sai/expired JWT, hoặc UnauthorizedException từ auth/guard/refresh token.</w:t>
+      </w:r>
+    </w:p>
+    <w:p>
+      <w:r>
+        <w:t>FORBIDDEN | 403 | You do not have permission to perform this action. | JWT hợp lệ nhưng role không đủ, hoặc clean CV chưa đủ điều kiện truy cập.</w:t>
+      </w:r>
+    </w:p>
+    <w:p>
+      <w:r>
+        <w:t>NOT_FOUND | 404 | Requested resource was not found. | Route không tồn tại hoặc lỗi dạng "... not found" không có code explicit.</w:t>
+      </w:r>
+    </w:p>
+    <w:p>
+      <w:r>
+        <w:t>INVALID_STATE_TRANSITION | 409 | This action is not available for the current state. | Chỉ áp dụng với BadRequestException không có code explicit nhưng message thuộc nhóm invalid state.</w:t>
+      </w:r>
+    </w:p>
+    <w:p>
+      <w:r>
+        <w:t>UPLOAD_RATE_LIMIT_EXCEEDED | 429 | Too many requests. Please retry later. | Endpoint bị throttle, hiện thấy ở auth/login và auth/refresh.</w:t>
+      </w:r>
+    </w:p>
+    <w:p>
+      <w:r>
+        <w:t>INTERNAL_SERVER_ERROR | 500 | Request could not be completed. Please retry later. | Lỗi server không được xử lý hoặc lỗi nhạy cảm bị che message.</w:t>
+      </w:r>
+    </w:p>
+    <w:p>
+      <w:pPr>
+        <w:pStyle w:val="Heading2"/>
+      </w:pPr>
+      <w:r>
+        <w:t>Mã lỗi theo từng API</w:t>
+      </w:r>
+    </w:p>
+    <w:p>
+      <w:pPr>
+        <w:pStyle w:val="Heading3"/>
+      </w:pPr>
+      <w:r>
+        <w:t>1. POST /api/auth/login</w:t>
+      </w:r>
+    </w:p>
+    <w:p>
+      <w:r>
+        <w:t>VALIDATION_ERROR | 400 | Request payload is invalid. | email/password thiếu, sai format, password dưới 6 ký tự, hoặc credentials không hợp lệ.</w:t>
+      </w:r>
+    </w:p>
+    <w:p>
+      <w:r>
+        <w:t>UPLOAD_RATE_LIMIT_EXCEEDED | 429 | Too many requests. Please retry later. | Vượt giới hạn 5 request/phút.</w:t>
+      </w:r>
+    </w:p>
+    <w:p>
+      <w:pPr>
+        <w:pStyle w:val="Heading3"/>
+      </w:pPr>
+      <w:r>
+        <w:t>2. GET /api/auth/me</w:t>
+      </w:r>
+    </w:p>
+    <w:p>
+      <w:r>
+        <w:t>UNAUTHORIZED | 401 | Authentication is required. | Thiếu/sai/expired access token.</w:t>
+      </w:r>
+    </w:p>
+    <w:p>
+      <w:pPr>
+        <w:pStyle w:val="Heading3"/>
+      </w:pPr>
+      <w:r>
+        <w:t>3. POST /api/auth/refresh</w:t>
+      </w:r>
+    </w:p>
+    <w:p>
+      <w:r>
+        <w:t>VALIDATION_ERROR | 400 | Request payload is invalid. | refreshToken thiếu/sai type/dưới 20 ký tự.</w:t>
+      </w:r>
+    </w:p>
+    <w:p>
+      <w:r>
+        <w:t>UNAUTHORIZED | 401 | Authentication is required. | Refresh token invalid, expired, revoked hoặc không tìm thấy user.</w:t>
+      </w:r>
+    </w:p>
+    <w:p>
+      <w:r>
+        <w:t>UPLOAD_RATE_LIMIT_EXCEEDED | 429 | Too many requests. Please retry later. | Vượt giới hạn 30 request/phút.</w:t>
+      </w:r>
+    </w:p>
+    <w:p>
+      <w:pPr>
+        <w:pStyle w:val="Heading3"/>
+      </w:pPr>
+      <w:r>
+        <w:t>4. POST /api/extension/instances/register</w:t>
+      </w:r>
+    </w:p>
+    <w:p>
+      <w:r>
+        <w:t>VALIDATION_ERROR | 400 | installId is required. | installId rỗng hoặc bị trim thành rỗng.</w:t>
+      </w:r>
+    </w:p>
+    <w:p>
+      <w:r>
+        <w:t>VALIDATION_ERROR | 400 | Request payload is invalid. | installId/displayName/version/capabilities/metadata sai DTO.</w:t>
+      </w:r>
+    </w:p>
+    <w:p>
+      <w:r>
+        <w:t>EXTENSION_INSTANCE_DISABLED | 400 | This extension instance has been disabled. | Register lại một instance đã bị disable.</w:t>
+      </w:r>
+    </w:p>
+    <w:p>
+      <w:pPr>
+        <w:pStyle w:val="Heading3"/>
+      </w:pPr>
+      <w:r>
+        <w:t>5. POST /api/extension/instances/heartbeat</w:t>
+      </w:r>
+    </w:p>
+    <w:p>
+      <w:r>
+        <w:t>EXTENSION_INSTANCE_REQUIRED | 400 | X-Extension-Instance-Id header is required. | Thiếu header instance id.</w:t>
+      </w:r>
+    </w:p>
+    <w:p>
+      <w:r>
+        <w:t>EXTENSION_INSTANCE_NOT_FOUND | 400 | Extension instance was not found for this account. | Instance không thuộc user hiện tại hoặc không tồn tại.</w:t>
+      </w:r>
+    </w:p>
+    <w:p>
+      <w:r>
+        <w:t>EXTENSION_INSTANCE_DISABLED | 400 | This extension instance has been disabled. | Instance đã bị disable.</w:t>
+      </w:r>
+    </w:p>
+    <w:p>
+      <w:r>
+        <w:t>VALIDATION_ERROR | 400 | Request payload is invalid. | displayName/version/capabilities/metadata sai DTO.</w:t>
+      </w:r>
+    </w:p>
+    <w:p>
+      <w:pPr>
+        <w:pStyle w:val="Heading3"/>
+      </w:pPr>
+      <w:r>
+        <w:t>6. GET /api/extension/tasks/next</w:t>
+      </w:r>
+    </w:p>
+    <w:p>
+      <w:r>
+        <w:t>EXTENSION_INSTANCE_REQUIRED | 400 | X-Extension-Instance-Id header is required. | Thiếu header instance id.</w:t>
+      </w:r>
+    </w:p>
+    <w:p>
+      <w:r>
+        <w:t>EXTENSION_INSTANCE_NOT_FOUND | 400 | Extension instance was not found for this account. | Instance không thuộc user hiện tại hoặc không tồn tại.</w:t>
+      </w:r>
+    </w:p>
+    <w:p>
+      <w:r>
+        <w:t>EXTENSION_INSTANCE_DISABLED | 400 | This extension instance has been disabled. | Instance đã bị disable. Không có task phù hợp thì success với data = null, không phải lỗi.</w:t>
+      </w:r>
+    </w:p>
+    <w:p>
+      <w:pPr>
+        <w:pStyle w:val="Heading3"/>
+      </w:pPr>
+      <w:r>
+        <w:t>7. POST /api/extension/tasks/:id/start</w:t>
+      </w:r>
+    </w:p>
+    <w:p>
+      <w:r>
+        <w:t>EXTENSION_INSTANCE_REQUIRED | 400 | X-Extension-Instance-Id header is required. | Thiếu header instance id.</w:t>
+      </w:r>
+    </w:p>
+    <w:p>
+      <w:r>
+        <w:t>EXTENSION_INSTANCE_NOT_FOUND | 400 | Extension instance was not found for this account. | Instance không thuộc user hiện tại hoặc không tồn tại.</w:t>
+      </w:r>
+    </w:p>
+    <w:p>
+      <w:r>
+        <w:t>EXTENSION_INSTANCE_DISABLED | 400 | This extension instance has been disabled. | Instance đã bị disable.</w:t>
+      </w:r>
+    </w:p>
+    <w:p>
+      <w:r>
+        <w:t>EXTENSION_TASK_NOT_CLAIMED | 400 | Extension task is not claimed by this instance. | Task không ở trạng thái CLAIMED/RUNNING bởi instance hiện tại.</w:t>
+      </w:r>
+    </w:p>
+    <w:p>
+      <w:pPr>
+        <w:pStyle w:val="Heading3"/>
+      </w:pPr>
+      <w:r>
+        <w:t>8. POST /api/extension/tasks/:id/progress</w:t>
+      </w:r>
+    </w:p>
+    <w:p>
+      <w:r>
+        <w:t>EXTENSION_INSTANCE_REQUIRED | 400 | X-Extension-Instance-Id header is required. | Thiếu header instance id.</w:t>
+      </w:r>
+    </w:p>
+    <w:p>
+      <w:r>
+        <w:t>EXTENSION_INSTANCE_NOT_FOUND | 400 | Extension instance was not found for this account. | Instance không thuộc user hiện tại hoặc không tồn tại.</w:t>
+      </w:r>
+    </w:p>
+    <w:p>
+      <w:r>
+        <w:t>EXTENSION_INSTANCE_DISABLED | 400 | This extension instance has been disabled. | Instance đã bị disable.</w:t>
+      </w:r>
+    </w:p>
+    <w:p>
+      <w:r>
+        <w:t>EXTENSION_TASK_NOT_CLAIMED | 400 | Extension task is not claimed by this instance. | Task không ở trạng thái CLAIMED/RUNNING bởi instance hiện tại.</w:t>
+      </w:r>
+    </w:p>
+    <w:p>
+      <w:r>
+        <w:t>VALIDATION_ERROR | 400 | Request payload is invalid. | eventType thiếu/quá 80 ký tự hoặc payload sai DTO.</w:t>
+      </w:r>
+    </w:p>
+    <w:p>
+      <w:pPr>
+        <w:pStyle w:val="Heading3"/>
+      </w:pPr>
+      <w:r>
+        <w:t>9. POST /api/extension/tasks/:id/complete</w:t>
+      </w:r>
+    </w:p>
+    <w:p>
+      <w:r>
+        <w:t>EXTENSION_INSTANCE_REQUIRED | 400 | X-Extension-Instance-Id header is required. | Thiếu header instance id.</w:t>
+      </w:r>
+    </w:p>
+    <w:p>
+      <w:r>
+        <w:t>EXTENSION_INSTANCE_NOT_FOUND | 400 | Extension instance was not found for this account. | Instance không thuộc user hiện tại hoặc không tồn tại.</w:t>
+      </w:r>
+    </w:p>
+    <w:p>
+      <w:r>
+        <w:t>EXTENSION_INSTANCE_DISABLED | 400 | This extension instance has been disabled. | Instance đã bị disable.</w:t>
+      </w:r>
+    </w:p>
+    <w:p>
+      <w:r>
+        <w:t>EXTENSION_TASK_NOT_CLAIMED | 400 | Extension task is not claimed by this instance. | Task không ở trạng thái CLAIMED/RUNNING bởi instance hiện tại.</w:t>
+      </w:r>
+    </w:p>
+    <w:p>
+      <w:r>
+        <w:t>VALIDATION_ERROR | 400 | Request payload is invalid. | result không phải object khi gửi lên.</w:t>
+      </w:r>
+    </w:p>
+    <w:p>
+      <w:pPr>
+        <w:pStyle w:val="Heading3"/>
+      </w:pPr>
+      <w:r>
+        <w:t>10. POST /api/extension/tasks/:id/fail</w:t>
+      </w:r>
+    </w:p>
+    <w:p>
+      <w:r>
+        <w:t>EXTENSION_INSTANCE_REQUIRED | 400 | X-Extension-Instance-Id header is required. | Thiếu header instance id.</w:t>
+      </w:r>
+    </w:p>
+    <w:p>
+      <w:r>
+        <w:t>EXTENSION_INSTANCE_NOT_FOUND | 400 | Extension instance was not found for this account. | Instance không thuộc user hiện tại hoặc không tồn tại.</w:t>
+      </w:r>
+    </w:p>
+    <w:p>
+      <w:r>
+        <w:t>EXTENSION_INSTANCE_DISABLED | 400 | This extension instance has been disabled. | Instance đã bị disable.</w:t>
+      </w:r>
+    </w:p>
+    <w:p>
+      <w:r>
+        <w:t>EXTENSION_TASK_NOT_CLAIMED | 400 | Extension task is not claimed by this instance. | Task không ở trạng thái CLAIMED/RUNNING bởi instance hiện tại.</w:t>
+      </w:r>
+    </w:p>
+    <w:p>
+      <w:r>
+        <w:t>VALIDATION_ERROR | 400 | Request payload is invalid. | errorCode/errorMessage thiếu hoặc errorCode quá 80 ký tự.</w:t>
+      </w:r>
+    </w:p>
+    <w:p>
+      <w:pPr>
+        <w:pStyle w:val="Heading3"/>
+      </w:pPr>
+      <w:r>
+        <w:t>11. GET /api/job-descriptions</w:t>
+      </w:r>
+    </w:p>
+    <w:p>
+      <w:r>
+        <w:t>VALIDATION_ERROR | 400 | Request payload is invalid. | Query page/limit/status/positionId/levelId/sortBy/sortOrder sai; status không hợp lệ cũng bị public thành message chung.</w:t>
+      </w:r>
+    </w:p>
+    <w:p>
+      <w:pPr>
+        <w:pStyle w:val="Heading3"/>
+      </w:pPr>
+      <w:r>
+        <w:t>12. POST /api/extension/amis/job-postings/sync-and-publish</w:t>
+      </w:r>
+    </w:p>
+    <w:p>
+      <w:r>
+        <w:t>IDEMPOTENCY_KEY_REQUIRED | 400 | Idempotency-Key header is required. | Thiếu header Idempotency-Key.</w:t>
+      </w:r>
+    </w:p>
+    <w:p>
+      <w:r>
+        <w:t>IDEMPOTENCY_KEY_CONFLICT | 409 | Idempotency-Key was already used for a different request body. | Reuse key với request body khác.</w:t>
+      </w:r>
+    </w:p>
+    <w:p>
+      <w:r>
+        <w:t>IDEMPOTENCY_REQUEST_IN_PROGRESS | 409 | Request with this Idempotency-Key is already processing. | Request cùng key đang xử lý.</w:t>
+      </w:r>
+    </w:p>
+    <w:p>
+      <w:r>
+        <w:t>IDEMPOTENCY_REQUEST_FAILED_RETRY_WITH_NEW_KEY | 409 | Previous request with this Idempotency-Key failed. Retry with a new Idempotency-Key. | Key đã có request fail trước đó.</w:t>
+      </w:r>
+    </w:p>
+    <w:p>
+      <w:r>
+        <w:t>IDEMPOTENCY_REPLAY_RESPONSE_INVALID | 400 | Stored idempotency response is invalid. | Replay response đã lưu không đúng shape.</w:t>
+      </w:r>
+    </w:p>
+    <w:p>
+      <w:r>
+        <w:t>VALIDATION_ERROR | 400 | Only PUBLISH action is supported for extension integration MVP. | action khác PUBLISH.</w:t>
+      </w:r>
+    </w:p>
+    <w:p>
+      <w:r>
+        <w:t>VALIDATION_ERROR | 400 | AMIS job posting sync only accepts AMIS as sourceSystem. | sourceSystem khác AMIS.</w:t>
+      </w:r>
+    </w:p>
+    <w:p>
+      <w:r>
+        <w:t>VALIDATION_ERROR | 400 | snapshot.benefits must be a JSON object, string, or null. | benefits sai type.</w:t>
+      </w:r>
+    </w:p>
+    <w:p>
+      <w:r>
+        <w:t>VALIDATION_ERROR | 400 | snapshot.summary is required or must be derivable from snapshot.description. | Không derive được summary.</w:t>
+      </w:r>
+    </w:p>
+    <w:p>
+      <w:r>
+        <w:t>VALIDATION_ERROR | 400 | snapshot.deadline must be a valid date. | deadline không parse được.</w:t>
+      </w:r>
+    </w:p>
+    <w:p>
+      <w:r>
+        <w:t>VALIDATION_ERROR | 400 | snapshot.deadline must be in the future. | deadline không ở tương lai.</w:t>
+      </w:r>
+    </w:p>
+    <w:p>
+      <w:r>
+        <w:t>VALIDATION_ERROR | 400 | Public slug is required. | title không tạo được slug hợp lệ.</w:t>
+      </w:r>
+    </w:p>
+    <w:p>
+      <w:r>
+        <w:t>FACEBOOK_TARGETS_REQUIRED | 400 | Select at least one Facebook group before publishing. | Chọn channel FACEBOOK nhưng không gửi target hợp lệ.</w:t>
+      </w:r>
+    </w:p>
+    <w:p>
+      <w:r>
+        <w:t>FACEBOOK_TARGETS_INVALID | 400 | Selected Facebook group ids must be valid UUIDs. | target id sai format UUID.</w:t>
+      </w:r>
+    </w:p>
+    <w:p>
+      <w:r>
+        <w:t>FACEBOOK_TARGETS_INVALID | 400 | One or more selected Facebook groups are unavailable for this account. | target không thuộc user/không active/không phải GROUP.</w:t>
+      </w:r>
+    </w:p>
+    <w:p>
+      <w:r>
+        <w:t>FACEBOOK_TARGETS_NOT_ELIGIBLE | 400 | One or more selected Facebook groups need verification or have reached the daily publish limit. | target chưa verify hoặc hết quota ngày.</w:t>
+      </w:r>
+    </w:p>
+    <w:p>
+      <w:r>
+        <w:t>INVALID_STATE_TRANSITION | 400 | Closed job posting cannot be updated from extension integration. | AMIS recruitment đã map tới posting CLOSED.</w:t>
+      </w:r>
+    </w:p>
+    <w:p>
+      <w:r>
+        <w:t>Cảnh báo trong success response: FACEBOOK_TARGETS_NOT_CONFIGURED | No eligible Facebook publish targets are configured or available today.</w:t>
+      </w:r>
+    </w:p>
+    <w:p>
+      <w:r>
+        <w:t>Cảnh báo trong success response: CHANNEL_NOT_CONFIGURED | {channel} is not configured for automatic publishing.</w:t>
+      </w:r>
+    </w:p>
+    <w:p>
+      <w:pPr>
+        <w:pStyle w:val="Heading3"/>
+      </w:pPr>
+      <w:r>
+        <w:t>13. POST /api/extension/amis/careers/sync</w:t>
+      </w:r>
+    </w:p>
+    <w:p>
+      <w:r>
+        <w:t>VALIDATION_ERROR | 400 | At least one AMIS career item with amisCareerId and name is required. | Payload rỗng hoặc toàn item thiếu amisCareerId/name.</w:t>
+      </w:r>
+    </w:p>
+    <w:p>
+      <w:r>
+        <w:t>VALIDATION_ERROR | 400 | Request payload is invalid. | items/sourceUrl/metadata sai DTO.</w:t>
+      </w:r>
+    </w:p>
+    <w:p>
+      <w:r>
+        <w:t>EXTENSION_INSTANCE_NOT_FOUND | 400 | Extension instance was not found for this account. | Có gửi X-Extension-Instance-Id nhưng instance không hợp lệ.</w:t>
+      </w:r>
+    </w:p>
+    <w:p>
+      <w:r>
+        <w:t>EXTENSION_INSTANCE_DISABLED | 400 | This extension instance has been disabled. | Có gửi X-Extension-Instance-Id nhưng instance đã disable.</w:t>
+      </w:r>
+    </w:p>
+    <w:p>
+      <w:pPr>
+        <w:pStyle w:val="Heading3"/>
+      </w:pPr>
+      <w:r>
+        <w:t>14. POST /api/extension/amis/applications/sync</w:t>
+      </w:r>
+    </w:p>
+    <w:p>
+      <w:r>
+        <w:t>VALIDATION_ERROR | 400 | At least one AMIS candidate item with recruitment, round, candidate, and contact data is required. | Không có item hợp lệ sau normalize.</w:t>
+      </w:r>
+    </w:p>
+    <w:p>
+      <w:r>
+        <w:t>VALIDATION_ERROR | 400 | AMIS application sync must contain candidates from a single RecruitmentID. | Payload chứa nhiều recruitmentId.</w:t>
+      </w:r>
+    </w:p>
+    <w:p>
+      <w:r>
+        <w:t>AMIS_RECRUITMENT_NOT_SYNCED | 400 | AMIS recruitment is not mapped to an internal job posting yet. | recruitmentId chưa từng sync-and-publish.</w:t>
+      </w:r>
+    </w:p>
+    <w:p>
+      <w:r>
+        <w:t>VALIDATION_ERROR | 400 | Request payload is invalid. | items/sourceUrl/metadata hoặc email sai DTO.</w:t>
+      </w:r>
+    </w:p>
+    <w:p>
+      <w:r>
+        <w:t>EXTENSION_INSTANCE_NOT_FOUND | 400 | Extension instance was not found for this account. | Có gửi X-Extension-Instance-Id nhưng instance không hợp lệ.</w:t>
+      </w:r>
+    </w:p>
+    <w:p>
+      <w:pPr>
+        <w:pStyle w:val="Heading3"/>
+      </w:pPr>
+      <w:r>
+        <w:t>15. POST /api/extension/vcs-portal/jds/sync</w:t>
+      </w:r>
+    </w:p>
+    <w:p>
+      <w:r>
+        <w:t>VCS_PORTAL_SYNC_IN_PROGRESS | 400 | A VCS Portal JD sync is already running. | Có sync khác đang chạy.</w:t>
+      </w:r>
+    </w:p>
+    <w:p>
+      <w:r>
+        <w:t>VCS_PORTAL_CONFIG_MISSING | 400 | {name} is required before syncing VCS Portal job descriptions. | Thiếu VCS_PORTAL_BASE_URL hoặc VCS_PORTAL_API_KEY.</w:t>
+      </w:r>
+    </w:p>
+    <w:p>
+      <w:r>
+        <w:t>VCS_PORTAL_MAX_PAGES_EXCEEDED | 400 | VCS Portal sync exceeded the configured maximum page count. | Số page vượt VCS_PORTAL_MAX_PAGES.</w:t>
+      </w:r>
+    </w:p>
+    <w:p>
+      <w:r>
+        <w:t>VCS_PORTAL_FETCH_FAILED | 400 | VCS Portal returned an unsuccessful response. | API ngoài trả non-2xx.</w:t>
+      </w:r>
+    </w:p>
+    <w:p>
+      <w:r>
+        <w:t>VCS_PORTAL_FETCH_TIMEOUT | 400 | VCS Portal request timed out. | Fetch timeout.</w:t>
+      </w:r>
+    </w:p>
+    <w:p>
+      <w:r>
+        <w:t>VCS_PORTAL_FETCH_ERROR | 400 | Unable to fetch VCS Portal job descriptions. | Lỗi fetch không phải timeout.</w:t>
+      </w:r>
+    </w:p>
+    <w:p>
+      <w:r>
+        <w:t>VCS_PORTAL_RESPONSE_INVALID | 400 | VCS Portal response must be an array or contain an array data field. | Response không phải array và không có data/items/results array.</w:t>
+      </w:r>
+    </w:p>
+    <w:p>
+      <w:r>
+        <w:t>Cảnh báo trong success response: VCS_PORTAL_ITEM_FAILED | Message an toàn từ lỗi map/sync từng item.</w:t>
+      </w:r>
+    </w:p>
+    <w:p>
+      <w:r>
+        <w:t>Cảnh báo trong success response: VCS_PORTAL_DEADLINE_INVALID | acf.end_date must use dd/MM/yyyy format. hoặc acf.end_date is not a valid calendar date.</w:t>
+      </w:r>
+    </w:p>
+    <w:p>
+      <w:r>
+        <w:t>Cảnh báo trong success response: VCS_PORTAL_CATEGORIES_INVALID | categories must be an array.</w:t>
+      </w:r>
+    </w:p>
+    <w:p>
+      <w:r>
+        <w:t>Cảnh báo trong success response: VCS_PORTAL_SOURCE_DATE_INVALID | {fieldName} could not be parsed as a source timestamp.</w:t>
+      </w:r>
+    </w:p>
+    <w:p>
+      <w:pPr>
+        <w:pStyle w:val="Heading3"/>
+      </w:pPr>
+      <w:r>
+        <w:t>16. GET /api/extension/amis/recruitments/:amisRecruitmentId/applications</w:t>
+      </w:r>
+    </w:p>
+    <w:p>
+      <w:r>
+        <w:t>VALIDATION_ERROR | 400 | amisRecruitmentId is required. | Param rỗng sau normalize.</w:t>
+      </w:r>
+    </w:p>
+    <w:p>
+      <w:r>
+        <w:t>AMIS_RECRUITMENT_NOT_SYNCED | 400 | AMIS recruitment is not mapped to an internal job posting yet. | recruitmentId chưa có mapping nội bộ.</w:t>
+      </w:r>
+    </w:p>
+    <w:p>
+      <w:pPr>
+        <w:pStyle w:val="Heading3"/>
+      </w:pPr>
+      <w:r>
+        <w:t>17. GET /api/extension/amis/job-descriptions/:jobDescriptionId/question-set</w:t>
+      </w:r>
+    </w:p>
+    <w:p>
+      <w:r>
+        <w:t>VALIDATION_ERROR | 400 | jobDescriptionId is required. | Param rỗng sau normalize.</w:t>
+      </w:r>
+    </w:p>
+    <w:p>
+      <w:r>
+        <w:t>JOB_DESCRIPTION_NOT_FOUND | 400 | Job description was not found. | Không tìm thấy JD nội bộ.</w:t>
+      </w:r>
+    </w:p>
+    <w:p>
+      <w:pPr>
+        <w:pStyle w:val="Heading3"/>
+      </w:pPr>
+      <w:r>
+        <w:t>18. GET /api/extension/amis/careers</w:t>
+      </w:r>
+    </w:p>
+    <w:p>
+      <w:r>
+        <w:t>Không có mã lỗi domain riêng. Áp dụng lỗi chung auth/role/server.</w:t>
+      </w:r>
+    </w:p>
+    <w:p>
+      <w:pPr>
+        <w:pStyle w:val="Heading3"/>
+      </w:pPr>
+      <w:r>
+        <w:t>19. GET /api/extension/amis/careers/:amisCareerId/questions</w:t>
+      </w:r>
+    </w:p>
+    <w:p>
+      <w:r>
+        <w:t>VALIDATION_ERROR | 400 | amisCareerId is required. | Param rỗng sau normalize.</w:t>
+      </w:r>
+    </w:p>
+    <w:p>
+      <w:r>
+        <w:t>AMIS_CAREER_NOT_FOUND | 400 | AMIS career was not found in the synced catalog. | Career không tồn tại, inactive hoặc removedFromAmisAt khác null.</w:t>
+      </w:r>
+    </w:p>
+    <w:p>
+      <w:pPr>
+        <w:pStyle w:val="Heading3"/>
+      </w:pPr>
+      <w:r>
+        <w:t>20. POST /api/extension/amis/careers/:amisCareerId/questions</w:t>
+      </w:r>
+    </w:p>
+    <w:p>
+      <w:r>
+        <w:t>VALIDATION_ERROR | 400 | amisCareerId is required. | Param rỗng sau normalize.</w:t>
+      </w:r>
+    </w:p>
+    <w:p>
+      <w:r>
+        <w:t>AMIS_CAREER_NOT_FOUND | 400 | AMIS career was not found in the synced catalog. | Career không tồn tại, inactive hoặc removedFromAmisAt khác null.</w:t>
+      </w:r>
+    </w:p>
+    <w:p>
+      <w:r>
+        <w:t>AMIS_CAREER_CATEGORY_NOT_MAPPED | 400 | Question category is not mapped to the selected AMIS career. | category request không thuộc questionCategoryNames của career.</w:t>
+      </w:r>
+    </w:p>
+    <w:p>
+      <w:r>
+        <w:t>VALIDATION_ERROR | 400 | Request payload is invalid. | category/subcategory/text/difficulty/type/competencyType sai DTO.</w:t>
+      </w:r>
+    </w:p>
+    <w:p>
+      <w:pPr>
+        <w:pStyle w:val="Heading3"/>
+      </w:pPr>
+      <w:r>
+        <w:t>21. GET /api/applications/:applicationId/cv/:cvDocumentId/clean-file</w:t>
+      </w:r>
+    </w:p>
+    <w:p>
+      <w:r>
+        <w:t>VALIDATION_ERROR | 400 | Request payload is invalid. | applicationId/cvDocumentId không phải UUID hoặc query disposition sai.</w:t>
+      </w:r>
+    </w:p>
+    <w:p>
+      <w:r>
+        <w:t>NOT_FOUND | 404 | Requested resource was not found. | Application/CV document không tồn tại khi lỗi không có code explicit.</w:t>
+      </w:r>
+    </w:p>
+    <w:p>
+      <w:r>
+        <w:t>FORBIDDEN | 403 | You do not have permission to perform this action. | Clean CV chưa available/access denied.</w:t>
+      </w:r>
+    </w:p>
+    <w:p>
+      <w:r>
+        <w:t>CLEAN_CV_FILE_UNAVAILABLE | 503 | Clean CV file is not available. | File safe storage mất, không đọc được, size &lt;= 0, hoặc stream lỗi trước khi gửi header.</w:t>
+      </w:r>
+    </w:p>
+    <w:p>
+      <w:pPr>
+        <w:pStyle w:val="Heading3"/>
+      </w:pPr>
+      <w:r>
+        <w:t>22. GET /api/extension/facebook/groups</w:t>
+      </w:r>
+    </w:p>
+    <w:p>
+      <w:r>
+        <w:t>EXTENSION_INSTANCE_NOT_FOUND | 400 | Extension instance was not found for this account. | Có gửi X-Extension-Instance-Id nhưng instance không hợp lệ.</w:t>
+      </w:r>
+    </w:p>
+    <w:p>
+      <w:r>
+        <w:t>EXTENSION_INSTANCE_DISABLED | 400 | This extension instance has been disabled. | Có gửi X-Extension-Instance-Id nhưng instance đã disable.</w:t>
+      </w:r>
+    </w:p>
+    <w:p>
+      <w:pPr>
+        <w:pStyle w:val="Heading3"/>
+      </w:pPr>
+      <w:r>
+        <w:t>23. POST /api/extension/facebook/groups</w:t>
+      </w:r>
+    </w:p>
+    <w:p>
+      <w:r>
+        <w:t>FACEBOOK_GROUP_ALREADY_EXISTS | 400 | Facebook group URL is already configured for this account. | URL group đã active cho user hiện tại.</w:t>
+      </w:r>
+    </w:p>
+    <w:p>
+      <w:r>
+        <w:t>FACEBOOK_GROUP_URL_INVALID | 400 | Facebook group URL must be a valid absolute URL. | URL không parse được.</w:t>
+      </w:r>
+    </w:p>
+    <w:p>
+      <w:r>
+        <w:t>FACEBOOK_GROUP_URL_INVALID | 400 | Facebook group URL must use a facebook.com domain. | Domain không phải facebook.com.</w:t>
+      </w:r>
+    </w:p>
+    <w:p>
+      <w:r>
+        <w:t>FACEBOOK_GROUP_URL_INVALID | 400 | Facebook group URL must match https://www.facebook.com/groups/{groupId}. | Path không đúng dạng group.</w:t>
+      </w:r>
+    </w:p>
+    <w:p>
+      <w:r>
+        <w:t>FACEBOOK_GROUP_URL_INVALID | 400 | Facebook group URL contains an invalid group id. | group id/slug không hợp lệ.</w:t>
+      </w:r>
+    </w:p>
+    <w:p>
+      <w:r>
+        <w:t>VALIDATION_ERROR | 400 | {fieldName} is required. | targetName/targetUrl rỗng sau normalize.</w:t>
+      </w:r>
+    </w:p>
+    <w:p>
+      <w:r>
+        <w:t>VALIDATION_ERROR | 400 | Request payload is invalid. | targetName/targetUrl sai DTO hoặc quá length.</w:t>
+      </w:r>
+    </w:p>
+    <w:p>
+      <w:pPr>
+        <w:pStyle w:val="Heading3"/>
+      </w:pPr>
+      <w:r>
+        <w:t>24. PUT /api/extension/facebook/groups/:targetId</w:t>
+      </w:r>
+    </w:p>
+    <w:p>
+      <w:r>
+        <w:t>FACEBOOK_GROUP_NOT_FOUND | 400 | Facebook group not found for this account. | targetId không thuộc user/không active/không phải GROUP.</w:t>
+      </w:r>
+    </w:p>
+    <w:p>
+      <w:r>
+        <w:t>FACEBOOK_GROUP_ALREADY_EXISTS | 400 | Facebook group URL is already configured for this account. | URL mới trùng group active khác.</w:t>
+      </w:r>
+    </w:p>
+    <w:p>
+      <w:r>
+        <w:t>FACEBOOK_GROUP_URL_INVALID | 400 | Facebook group URL must be a valid absolute URL. | URL không parse được.</w:t>
+      </w:r>
+    </w:p>
+    <w:p>
+      <w:r>
+        <w:t>FACEBOOK_GROUP_URL_INVALID | 400 | Facebook group URL must use a facebook.com domain. | Domain không phải facebook.com.</w:t>
+      </w:r>
+    </w:p>
+    <w:p>
+      <w:r>
+        <w:t>FACEBOOK_GROUP_URL_INVALID | 400 | Facebook group URL must match https://www.facebook.com/groups/{groupId}. | Path không đúng dạng group.</w:t>
+      </w:r>
+    </w:p>
+    <w:p>
+      <w:r>
+        <w:t>FACEBOOK_GROUP_URL_INVALID | 400 | Facebook group URL contains an invalid group id. | group id/slug không hợp lệ.</w:t>
+      </w:r>
+    </w:p>
+    <w:p>
+      <w:r>
+        <w:t>VALIDATION_ERROR | 400 | Request payload is invalid. | targetName/targetUrl sai DTO hoặc quá length.</w:t>
+      </w:r>
+    </w:p>
+    <w:p>
+      <w:pPr>
+        <w:pStyle w:val="Heading3"/>
+      </w:pPr>
+      <w:r>
+        <w:t>25. DELETE /api/extension/facebook/groups/:targetId</w:t>
+      </w:r>
+    </w:p>
+    <w:p>
+      <w:r>
+        <w:t>FACEBOOK_GROUP_NOT_FOUND | 400 | Facebook group not found for this account. | targetId không thuộc user/không active/không phải GROUP.</w:t>
+      </w:r>
+    </w:p>
+    <w:p>
+      <w:pPr>
+        <w:pStyle w:val="Heading3"/>
+      </w:pPr>
+      <w:r>
+        <w:t>26. POST /api/extension/facebook/groups/discover</w:t>
+      </w:r>
+    </w:p>
+    <w:p>
+      <w:r>
+        <w:t>VALIDATION_ERROR | 400 | Request payload is invalid. | groups thiếu/rỗng/quá 2000 item hoặc item sai DTO.</w:t>
+      </w:r>
+    </w:p>
+    <w:p>
+      <w:r>
+        <w:t>Lỗi từng item discovery không làm fail toàn request: data.errors có thể chứa message validate URL/group từ normalizeFacebookGroupUrl.</w:t>
+      </w:r>
+    </w:p>
+    <w:p>
+      <w:pPr>
+        <w:pStyle w:val="Heading3"/>
+      </w:pPr>
+      <w:r>
+        <w:t>27. POST /api/extension/facebook/groups/:targetId/verify-result</w:t>
+      </w:r>
+    </w:p>
+    <w:p>
+      <w:r>
+        <w:t>FACEBOOK_GROUP_NOT_FOUND | 400 | Facebook group not found for this account. | targetId không thuộc user/không active/không phải GROUP.</w:t>
+      </w:r>
+    </w:p>
+    <w:p>
+      <w:r>
+        <w:t>VALIDATION_ERROR | 400 | Request payload is invalid. | eligibilityStatus không thuộc enum, verifiedAt sai ISO8601, reason quá 1000 ký tự.</w:t>
+      </w:r>
+    </w:p>
+    <w:p>
+      <w:r>
+        <w:t>EXTENSION_INSTANCE_NOT_FOUND | 400 | Extension instance was not found for this account. | Có gửi X-Extension-Instance-Id nhưng instance không hợp lệ.</w:t>
+      </w:r>
+    </w:p>
+    <w:p>
+      <w:pPr>
+        <w:pStyle w:val="Heading3"/>
+      </w:pPr>
+      <w:r>
+        <w:t>28. GET /api/extension/facebook/groups/:targetId/publish-histories</w:t>
+      </w:r>
+    </w:p>
+    <w:p>
+      <w:r>
+        <w:t>FACEBOOK_GROUP_NOT_FOUND | 400 | Facebook group not found for this account. | targetId không thuộc user/không active/không phải GROUP.</w:t>
+      </w:r>
+    </w:p>
+    <w:p>
+      <w:r>
+        <w:t>Ghi chú: status query không hợp lệ hiện bị normalize thành null, không trả lỗi.</w:t>
+      </w:r>
+    </w:p>
+    <w:p>
+      <w:pPr>
+        <w:pStyle w:val="Heading3"/>
+      </w:pPr>
+      <w:r>
+        <w:t>29. POST /api/extension/facebook/publish-histories/:historyId/status-check</w:t>
+      </w:r>
+    </w:p>
+    <w:p>
+      <w:r>
+        <w:t>FACEBOOK_PUBLISH_HISTORY_NOT_FOUND | 400 | Facebook publish history not found for this account. | historyId không tồn tại hoặc không thuộc target của user.</w:t>
+      </w:r>
+    </w:p>
+    <w:p>
+      <w:r>
+        <w:t>VALIDATION_ERROR | 400 | Request payload is invalid. | facebookReviewStatus/message/externalPostUrl/externalPostId/checkedAt sai DTO.</w:t>
+      </w:r>
+    </w:p>
+    <w:p>
+      <w:r>
+        <w:t>EXTENSION_INSTANCE_NOT_FOUND | 400 | Extension instance was not found for this account. | Có gửi X-Extension-Instance-Id nhưng instance không hợp lệ.</w:t>
+      </w:r>
+    </w:p>
+    <w:p>
+      <w:pPr>
+        <w:pStyle w:val="Heading3"/>
+      </w:pPr>
+      <w:r>
+        <w:t>30. POST /api/extension/facebook/publish-results</w:t>
+      </w:r>
+    </w:p>
+    <w:p>
+      <w:r>
+        <w:t>NOT_FOUND | 404 | Requested resource was not found. | Job posting not found.</w:t>
+      </w:r>
+    </w:p>
+    <w:p>
+      <w:r>
+        <w:t>VALIDATION_ERROR | 400 | Request payload is invalid. | jobPostingId/targetId/targetType/status/message/submittedAt sai DTO.</w:t>
+      </w:r>
+    </w:p>
+    <w:p>
+      <w:r>
+        <w:t>EXTENSION_INSTANCE_NOT_FOUND | 400 | Extension instance was not found for this account. | Có gửi X-Extension-Instance-Id nhưng instance không hợp lệ.</w:t>
+      </w:r>
+    </w:p>
+    <w:p>
+      <w:pPr>
+        <w:pStyle w:val="Heading3"/>
+      </w:pPr>
+      <w:r>
+        <w:t>31. POST /api/extension/facebook/generate-preview-content</w:t>
+      </w:r>
+    </w:p>
+    <w:p>
+      <w:r>
+        <w:t>VALIDATION_ERROR | 400 | Request payload is invalid. | snapshot thiếu/sai DTO, mode không thuộc TEMPLATE/AI, facebookContent quá 10000 ký tự.</w:t>
+      </w:r>
+    </w:p>
+    <w:p>
+      <w:r>
+        <w:t>EXTENSION_INSTANCE_NOT_FOUND | 400 | Extension instance was not found for this account. | Có gửi X-Extension-Instance-Id nhưng instance không hợp lệ.</w:t>
+      </w:r>
+    </w:p>
+    <w:p>
+      <w:pPr>
+        <w:pStyle w:val="Heading3"/>
+      </w:pPr>
+      <w:r>
+        <w:t>32. GET {VCS_PORTAL_BASE_URL}/wp-json/vcs-portal/v1/jds</w:t>
+      </w:r>
+    </w:p>
+    <w:p>
+      <w:r>
+        <w:t>Đây là API ngoài, không dùng ApiExceptionFilter của backend. Khi backend gọi API này, lỗi được wrap ở POST /api/extension/vcs-portal/jds/sync thành các code VCS_PORTAL_FETCH_FAILED, VCS_PORTAL_FETCH_TIMEOUT, VCS_PORTAL_FETCH_ERROR hoặc VCS_PORTAL_RESPONSE_INVALID.</w:t>
+      </w:r>
+    </w:p>
+    <w:p>
+      <w:r>
+        <w:t>Khuyến nghị API ngoài trả non-2xx với JSON có message rõ ràng khi X-VCS-API-Key thiếu/sai; backend hiện chỉ public message VCS Portal returned an unsuccessful response kèm details status/statusText.</w:t>
+      </w:r>
+    </w:p>
     <w:sectPr>
       <w:pgSz w:w="11906" w:h="16838"/>
       <w:pgMar w:top="1080" w:right="1080" w:bottom="1080" w:left="1080" w:header="720" w:footer="720" w:gutter="0"/>

</xml_diff>